<commit_message>
Update on Lab 15 Answers
</commit_message>
<xml_diff>
--- a/Codes and Projects/Servicenow development/Day 15 Lab/Day 15 Lab Answers.docx
+++ b/Codes and Projects/Servicenow development/Day 15 Lab/Day 15 Lab Answers.docx
@@ -98,47 +98,29 @@
         <w:spacing w:after="0"/>
       </w:pPr>
       <w:r>
-        <w:t>•</w:t>
-      </w:r>
-      <w:r>
-        <w:t xml:space="preserve"> </w:t>
-      </w:r>
-      <w:r>
-        <w:t xml:space="preserve">auto escalate </w:t>
-      </w:r>
-    </w:p>
-    <w:p>
-      <w:pPr>
-        <w:tabs>
-          <w:tab w:val="left" w:pos="3420"/>
-        </w:tabs>
-        <w:spacing w:after="0"/>
-      </w:pPr>
-      <w:r>
-        <w:t>•</w:t>
-      </w:r>
-      <w:r>
-        <w:t xml:space="preserve"> C</w:t>
-      </w:r>
-      <w:r>
-        <w:t xml:space="preserve">reate management notification </w:t>
-      </w:r>
-    </w:p>
-    <w:p>
-      <w:pPr>
-        <w:tabs>
-          <w:tab w:val="left" w:pos="3420"/>
-        </w:tabs>
-        <w:spacing w:after="0"/>
-      </w:pPr>
-      <w:r>
-        <w:t>•</w:t>
-      </w:r>
-      <w:r>
-        <w:t xml:space="preserve"> A</w:t>
-      </w:r>
-      <w:r>
-        <w:t xml:space="preserve">ssign special response team </w:t>
+        <w:t xml:space="preserve">• auto escalate </w:t>
+      </w:r>
+    </w:p>
+    <w:p>
+      <w:pPr>
+        <w:tabs>
+          <w:tab w:val="left" w:pos="3420"/>
+        </w:tabs>
+        <w:spacing w:after="0"/>
+      </w:pPr>
+      <w:r>
+        <w:t xml:space="preserve">• Create management notification </w:t>
+      </w:r>
+    </w:p>
+    <w:p>
+      <w:pPr>
+        <w:tabs>
+          <w:tab w:val="left" w:pos="3420"/>
+        </w:tabs>
+        <w:spacing w:after="0"/>
+      </w:pPr>
+      <w:r>
+        <w:t xml:space="preserve">• Assign special response team </w:t>
       </w:r>
     </w:p>
     <w:p>
@@ -220,32 +202,26 @@
         <w:spacing w:after="0"/>
       </w:pPr>
       <w:r>
-        <w:t>•</w:t>
-      </w:r>
+        <w:t xml:space="preserve">• </w:t>
+      </w:r>
+      <w:proofErr w:type="spellStart"/>
+      <w:r>
+        <w:t>sn_customerservice_case</w:t>
+      </w:r>
+      <w:proofErr w:type="spellEnd"/>
       <w:r>
         <w:t xml:space="preserve"> </w:t>
       </w:r>
-      <w:proofErr w:type="spellStart"/>
-      <w:r>
-        <w:t>sn_customerservice_case</w:t>
-      </w:r>
-      <w:proofErr w:type="spellEnd"/>
-      <w:r>
-        <w:t xml:space="preserve"> </w:t>
-      </w:r>
-    </w:p>
-    <w:p>
-      <w:pPr>
-        <w:tabs>
-          <w:tab w:val="left" w:pos="3420"/>
-        </w:tabs>
-        <w:spacing w:after="0"/>
-      </w:pPr>
-      <w:r>
-        <w:t>•</w:t>
-      </w:r>
-      <w:r>
-        <w:t xml:space="preserve"> </w:t>
+    </w:p>
+    <w:p>
+      <w:pPr>
+        <w:tabs>
+          <w:tab w:val="left" w:pos="3420"/>
+        </w:tabs>
+        <w:spacing w:after="0"/>
+      </w:pPr>
+      <w:r>
+        <w:t xml:space="preserve">• </w:t>
       </w:r>
       <w:proofErr w:type="spellStart"/>
       <w:r>
@@ -923,8 +899,11 @@
         <w:br/>
       </w:r>
       <w:r>
+        <w:rPr>
+          <w:noProof/>
+        </w:rPr>
         <w:drawing>
-          <wp:inline distT="0" distB="0" distL="0" distR="0" wp14:anchorId="727114BD" wp14:editId="00D81132">
+          <wp:inline distT="0" distB="0" distL="0" distR="0" wp14:anchorId="727114BD" wp14:editId="6E25480C">
             <wp:extent cx="6858000" cy="2020570"/>
             <wp:effectExtent l="0" t="0" r="0" b="0"/>
             <wp:docPr id="2094635504" name="Picture 1"/>
@@ -987,8 +966,11 @@
         <w:spacing w:after="0"/>
       </w:pPr>
       <w:r>
+        <w:rPr>
+          <w:noProof/>
+        </w:rPr>
         <w:drawing>
-          <wp:inline distT="0" distB="0" distL="0" distR="0" wp14:anchorId="06C419A7" wp14:editId="26724330">
+          <wp:inline distT="0" distB="0" distL="0" distR="0" wp14:anchorId="06C419A7" wp14:editId="0E476B68">
             <wp:extent cx="6858000" cy="1738630"/>
             <wp:effectExtent l="0" t="0" r="0" b="0"/>
             <wp:docPr id="20882321" name="Picture 1"/>
@@ -1035,10 +1017,13 @@
         <w:t xml:space="preserve">Added the custom fields to detect for escalation </w:t>
       </w:r>
       <w:r>
+        <w:rPr>
+          <w:noProof/>
+        </w:rPr>
         <w:drawing>
-          <wp:inline distT="0" distB="0" distL="0" distR="0" wp14:anchorId="36F557A7" wp14:editId="63B47D03">
+          <wp:inline distT="0" distB="0" distL="0" distR="0" wp14:anchorId="36F557A7" wp14:editId="4B5D9087">
             <wp:extent cx="6858000" cy="3077845"/>
-            <wp:effectExtent l="0" t="0" r="0" b="8255"/>
+            <wp:effectExtent l="0" t="0" r="0" b="0"/>
             <wp:docPr id="2003923636" name="Picture 1"/>
             <wp:cNvGraphicFramePr>
               <a:graphicFrameLocks xmlns:a="http://schemas.openxmlformats.org/drawingml/2006/main" noChangeAspect="1"/>
@@ -1590,9 +1575,11 @@
         <w:pStyle w:val="Style1"/>
       </w:pPr>
     </w:p>
-    <w:p/>
-    <w:p>
-      <w:r>
+    <w:p>
+      <w:r>
+        <w:rPr>
+          <w:noProof/>
+        </w:rPr>
         <w:drawing>
           <wp:inline distT="0" distB="0" distL="0" distR="0" wp14:anchorId="06FCF1A1" wp14:editId="3EEC23EE">
             <wp:extent cx="6858000" cy="3675380"/>
@@ -1630,20 +1617,106 @@
         </w:drawing>
       </w:r>
     </w:p>
-    <w:p/>
-    <w:p/>
-    <w:p/>
-    <w:p/>
-    <w:p/>
-    <w:p/>
-    <w:p>
-      <w:pPr>
+    <w:p>
+      <w:pPr>
+        <w:pStyle w:val="Heading2"/>
+      </w:pPr>
+      <w:r>
+        <w:lastRenderedPageBreak/>
+        <w:t>Update Set Answers</w:t>
+      </w:r>
+    </w:p>
+    <w:p>
+      <w:r>
+        <w:t>Importing XML file sent and committing it for the PDI</w:t>
+      </w:r>
+      <w:r>
+        <w:br/>
+      </w:r>
+      <w:r>
+        <w:drawing>
+          <wp:inline distT="0" distB="0" distL="0" distR="0" wp14:anchorId="3AA5F948" wp14:editId="341645A4">
+            <wp:extent cx="6028660" cy="3259942"/>
+            <wp:effectExtent l="0" t="0" r="0" b="0"/>
+            <wp:docPr id="1802868018" name="Picture 1"/>
+            <wp:cNvGraphicFramePr>
+              <a:graphicFrameLocks xmlns:a="http://schemas.openxmlformats.org/drawingml/2006/main" noChangeAspect="1"/>
+            </wp:cNvGraphicFramePr>
+            <a:graphic xmlns:a="http://schemas.openxmlformats.org/drawingml/2006/main">
+              <a:graphicData uri="http://schemas.openxmlformats.org/drawingml/2006/picture">
+                <pic:pic xmlns:pic="http://schemas.openxmlformats.org/drawingml/2006/picture">
+                  <pic:nvPicPr>
+                    <pic:cNvPr id="1802868018" name=""/>
+                    <pic:cNvPicPr/>
+                  </pic:nvPicPr>
+                  <pic:blipFill>
+                    <a:blip r:embed="rId13"/>
+                    <a:stretch>
+                      <a:fillRect/>
+                    </a:stretch>
+                  </pic:blipFill>
+                  <pic:spPr>
+                    <a:xfrm>
+                      <a:off x="0" y="0"/>
+                      <a:ext cx="6041951" cy="3267129"/>
+                    </a:xfrm>
+                    <a:prstGeom prst="rect">
+                      <a:avLst/>
+                    </a:prstGeom>
+                  </pic:spPr>
+                </pic:pic>
+              </a:graphicData>
+            </a:graphic>
+          </wp:inline>
+        </w:drawing>
+      </w:r>
+      <w:r>
+        <w:br/>
+        <w:t>Another Update done on and created a second version for Update set</w:t>
+      </w:r>
+      <w:r>
+        <w:br/>
+      </w:r>
+      <w:r>
         <w:rPr>
-          <w:rFonts w:ascii="Lucida Console" w:hAnsi="Lucida Console"/>
           <w:noProof/>
-          <w:sz w:val="18"/>
         </w:rPr>
-      </w:pPr>
+        <w:drawing>
+          <wp:inline distT="0" distB="0" distL="0" distR="0" wp14:anchorId="1DB33260" wp14:editId="2FC2F640">
+            <wp:extent cx="6060558" cy="2933759"/>
+            <wp:effectExtent l="0" t="0" r="0" b="0"/>
+            <wp:docPr id="1812096018" name="Picture 1"/>
+            <wp:cNvGraphicFramePr>
+              <a:graphicFrameLocks xmlns:a="http://schemas.openxmlformats.org/drawingml/2006/main" noChangeAspect="1"/>
+            </wp:cNvGraphicFramePr>
+            <a:graphic xmlns:a="http://schemas.openxmlformats.org/drawingml/2006/main">
+              <a:graphicData uri="http://schemas.openxmlformats.org/drawingml/2006/picture">
+                <pic:pic xmlns:pic="http://schemas.openxmlformats.org/drawingml/2006/picture">
+                  <pic:nvPicPr>
+                    <pic:cNvPr id="1812096018" name=""/>
+                    <pic:cNvPicPr/>
+                  </pic:nvPicPr>
+                  <pic:blipFill>
+                    <a:blip r:embed="rId14"/>
+                    <a:stretch>
+                      <a:fillRect/>
+                    </a:stretch>
+                  </pic:blipFill>
+                  <pic:spPr>
+                    <a:xfrm>
+                      <a:off x="0" y="0"/>
+                      <a:ext cx="6071978" cy="2939287"/>
+                    </a:xfrm>
+                    <a:prstGeom prst="rect">
+                      <a:avLst/>
+                    </a:prstGeom>
+                  </pic:spPr>
+                </pic:pic>
+              </a:graphicData>
+            </a:graphic>
+          </wp:inline>
+        </w:drawing>
+      </w:r>
     </w:p>
     <w:p>
       <w:pPr>
@@ -1651,9 +1724,6 @@
           <w:tab w:val="left" w:pos="1605"/>
         </w:tabs>
       </w:pPr>
-      <w:r>
-        <w:tab/>
-      </w:r>
     </w:p>
     <w:sectPr>
       <w:type w:val="continuous"/>
@@ -3104,7 +3174,7 @@
   <w:style w:type="paragraph" w:default="1" w:styleId="Normal">
     <w:name w:val="Normal"/>
     <w:qFormat/>
-    <w:rsid w:val="00993D60"/>
+    <w:rsid w:val="00016B60"/>
   </w:style>
   <w:style w:type="paragraph" w:styleId="Heading1">
     <w:name w:val="heading 1"/>

</xml_diff>